<commit_message>
fix: use supplied Baylyk service contract and correct invoice columns (v44)
</commit_message>
<xml_diff>
--- a/docs/templates/invoice-ip.docx
+++ b/docs/templates/invoice-ip.docx
@@ -799,8 +799,8 @@
         <w:tc>
           <w:tcPr>
             <w:tcBorders>
-              <w:top w:color="cccccc" w:space="0" w:sz="6" w:val="single"/>
-              <w:left w:color="cccccc" w:space="0" w:sz="6" w:val="single"/>
+              <w:top w:color="000000" w:space="0" w:sz="6" w:val="single"/>
+              <w:left w:color="000000" w:space="0" w:sz="6" w:val="single"/>
               <w:bottom w:color="000000" w:space="0" w:sz="6" w:val="single"/>
               <w:right w:color="000000" w:space="0" w:sz="6" w:val="single"/>
             </w:tcBorders>
@@ -836,8 +836,8 @@
         <w:tc>
           <w:tcPr>
             <w:tcBorders>
-              <w:top w:color="cccccc" w:space="0" w:sz="6" w:val="single"/>
-              <w:left w:color="cccccc" w:space="0" w:sz="6" w:val="single"/>
+              <w:top w:color="000000" w:space="0" w:sz="6" w:val="single"/>
+              <w:left w:color="000000" w:space="0" w:sz="6" w:val="single"/>
               <w:bottom w:color="000000" w:space="0" w:sz="6" w:val="single"/>
               <w:right w:color="000000" w:space="0" w:sz="6" w:val="single"/>
             </w:tcBorders>
@@ -867,6 +867,45 @@
                 <w:szCs w:val="24"/>
                 <w:rtl w:val="0"/>
               </w:rPr>
+              <w:t xml:space="preserve">{{itemQuantity}}</w:t>
+            </w:r>
+          </w:p>
+        </w:tc>
+        <w:tc>
+          <w:tcPr>
+            <w:tcBorders>
+              <w:top w:color="000000" w:space="0" w:sz="6" w:val="single"/>
+              <w:left w:color="000000" w:space="0" w:sz="6" w:val="single"/>
+              <w:bottom w:color="000000" w:space="0" w:sz="6" w:val="single"/>
+              <w:right w:color="000000" w:space="0" w:sz="6" w:val="single"/>
+            </w:tcBorders>
+            <w:shd w:fill="auto" w:val="clear"/>
+            <w:tcMar>
+              <w:top w:w="99.77952755905513" w:type="dxa"/>
+              <w:left w:w="99.77952755905513" w:type="dxa"/>
+              <w:bottom w:w="99.77952755905513" w:type="dxa"/>
+              <w:right w:w="99.77952755905513" w:type="dxa"/>
+            </w:tcMar>
+            <w:vAlign w:val="center"/>
+          </w:tcPr>
+          <w:p>
+            <w:pPr>
+              <w:widowControl w:val="0"/>
+              <w:spacing w:line="240" w:lineRule="auto"/>
+              <w:jc w:val="center"/>
+              <w:rPr>
+                <w:rFonts w:ascii="Times New Roman" w:cs="Times New Roman" w:eastAsia="Times New Roman" w:hAnsi="Times New Roman"/>
+                <w:sz w:val="24"/>
+                <w:szCs w:val="24"/>
+              </w:rPr>
+            </w:pPr>
+            <w:r>
+              <w:rPr>
+                <w:rFonts w:ascii="Times New Roman" w:cs="Times New Roman" w:eastAsia="Times New Roman" w:hAnsi="Times New Roman"/>
+                <w:sz w:val="24"/>
+                <w:szCs w:val="24"/>
+                <w:rtl w:val="0"/>
+              </w:rPr>
               <w:t xml:space="preserve">{{itemUnit}}</w:t>
             </w:r>
           </w:p>
@@ -874,8 +913,8 @@
         <w:tc>
           <w:tcPr>
             <w:tcBorders>
-              <w:top w:color="cccccc" w:space="0" w:sz="6" w:val="single"/>
-              <w:left w:color="cccccc" w:space="0" w:sz="6" w:val="single"/>
+              <w:top w:color="000000" w:space="0" w:sz="6" w:val="single"/>
+              <w:left w:color="000000" w:space="0" w:sz="6" w:val="single"/>
               <w:bottom w:color="000000" w:space="0" w:sz="6" w:val="single"/>
               <w:right w:color="000000" w:space="0" w:sz="6" w:val="single"/>
             </w:tcBorders>
@@ -906,45 +945,6 @@
                 <w:szCs w:val="24"/>
                 <w:rtl w:val="0"/>
               </w:rPr>
-              <w:t xml:space="preserve">{{itemQuantity}}</w:t>
-            </w:r>
-          </w:p>
-        </w:tc>
-        <w:tc>
-          <w:tcPr>
-            <w:tcBorders>
-              <w:top w:color="cccccc" w:space="0" w:sz="6" w:val="single"/>
-              <w:left w:color="cccccc" w:space="0" w:sz="6" w:val="single"/>
-              <w:bottom w:color="000000" w:space="0" w:sz="6" w:val="single"/>
-              <w:right w:color="000000" w:space="0" w:sz="6" w:val="single"/>
-            </w:tcBorders>
-            <w:shd w:fill="auto" w:val="clear"/>
-            <w:tcMar>
-              <w:top w:w="99.77952755905513" w:type="dxa"/>
-              <w:left w:w="99.77952755905513" w:type="dxa"/>
-              <w:bottom w:w="99.77952755905513" w:type="dxa"/>
-              <w:right w:w="99.77952755905513" w:type="dxa"/>
-            </w:tcMar>
-            <w:vAlign w:val="center"/>
-          </w:tcPr>
-          <w:p>
-            <w:pPr>
-              <w:widowControl w:val="0"/>
-              <w:spacing w:line="240" w:lineRule="auto"/>
-              <w:jc w:val="center"/>
-              <w:rPr>
-                <w:rFonts w:ascii="Times New Roman" w:cs="Times New Roman" w:eastAsia="Times New Roman" w:hAnsi="Times New Roman"/>
-                <w:sz w:val="24"/>
-                <w:szCs w:val="24"/>
-              </w:rPr>
-            </w:pPr>
-            <w:r>
-              <w:rPr>
-                <w:rFonts w:ascii="Times New Roman" w:cs="Times New Roman" w:eastAsia="Times New Roman" w:hAnsi="Times New Roman"/>
-                <w:sz w:val="24"/>
-                <w:szCs w:val="24"/>
-                <w:rtl w:val="0"/>
-              </w:rPr>
               <w:t xml:space="preserve">{{itemPrice}}</w:t>
             </w:r>
           </w:p>
@@ -952,8 +952,8 @@
         <w:tc>
           <w:tcPr>
             <w:tcBorders>
-              <w:top w:color="cccccc" w:space="0" w:sz="6" w:val="single"/>
-              <w:left w:color="cccccc" w:space="0" w:sz="6" w:val="single"/>
+              <w:top w:color="000000" w:space="0" w:sz="6" w:val="single"/>
+              <w:left w:color="000000" w:space="0" w:sz="6" w:val="single"/>
               <w:bottom w:color="000000" w:space="0" w:sz="6" w:val="single"/>
               <w:right w:color="000000" w:space="0" w:sz="6" w:val="single"/>
             </w:tcBorders>
@@ -999,7 +999,7 @@
         <w:tc>
           <w:tcPr>
             <w:tcBorders>
-              <w:top w:color="cccccc" w:space="0" w:sz="6" w:val="single"/>
+              <w:top w:color="000000" w:space="0" w:sz="6" w:val="single"/>
               <w:left w:color="000000" w:space="0" w:sz="6" w:val="single"/>
               <w:bottom w:color="000000" w:space="0" w:sz="6" w:val="single"/>
               <w:right w:color="000000" w:space="0" w:sz="6" w:val="single"/>
@@ -1036,8 +1036,8 @@
         <w:tc>
           <w:tcPr>
             <w:tcBorders>
-              <w:top w:color="cccccc" w:space="0" w:sz="6" w:val="single"/>
-              <w:left w:color="cccccc" w:space="0" w:sz="6" w:val="single"/>
+              <w:top w:color="000000" w:space="0" w:sz="6" w:val="single"/>
+              <w:left w:color="000000" w:space="0" w:sz="6" w:val="single"/>
               <w:bottom w:color="000000" w:space="0" w:sz="6" w:val="single"/>
               <w:right w:color="000000" w:space="0" w:sz="6" w:val="single"/>
             </w:tcBorders>
@@ -1073,8 +1073,8 @@
         <w:tc>
           <w:tcPr>
             <w:tcBorders>
-              <w:top w:color="cccccc" w:space="0" w:sz="6" w:val="single"/>
-              <w:left w:color="cccccc" w:space="0" w:sz="6" w:val="single"/>
+              <w:top w:color="000000" w:space="0" w:sz="6" w:val="single"/>
+              <w:left w:color="000000" w:space="0" w:sz="6" w:val="single"/>
               <w:bottom w:color="000000" w:space="0" w:sz="6" w:val="single"/>
               <w:right w:color="000000" w:space="0" w:sz="6" w:val="single"/>
             </w:tcBorders>
@@ -1104,6 +1104,45 @@
                 <w:szCs w:val="24"/>
                 <w:rtl w:val="0"/>
               </w:rPr>
+              <w:t xml:space="preserve">{{itemQuantity}}</w:t>
+            </w:r>
+          </w:p>
+        </w:tc>
+        <w:tc>
+          <w:tcPr>
+            <w:tcBorders>
+              <w:top w:color="000000" w:space="0" w:sz="6" w:val="single"/>
+              <w:left w:color="000000" w:space="0" w:sz="6" w:val="single"/>
+              <w:bottom w:color="000000" w:space="0" w:sz="6" w:val="single"/>
+              <w:right w:color="000000" w:space="0" w:sz="6" w:val="single"/>
+            </w:tcBorders>
+            <w:shd w:fill="auto" w:val="clear"/>
+            <w:tcMar>
+              <w:top w:w="99.77952755905513" w:type="dxa"/>
+              <w:left w:w="99.77952755905513" w:type="dxa"/>
+              <w:bottom w:w="99.77952755905513" w:type="dxa"/>
+              <w:right w:w="99.77952755905513" w:type="dxa"/>
+            </w:tcMar>
+            <w:vAlign w:val="center"/>
+          </w:tcPr>
+          <w:p>
+            <w:pPr>
+              <w:widowControl w:val="0"/>
+              <w:spacing w:line="240" w:lineRule="auto"/>
+              <w:jc w:val="center"/>
+              <w:rPr>
+                <w:rFonts w:ascii="Times New Roman" w:cs="Times New Roman" w:eastAsia="Times New Roman" w:hAnsi="Times New Roman"/>
+                <w:sz w:val="24"/>
+                <w:szCs w:val="24"/>
+              </w:rPr>
+            </w:pPr>
+            <w:r>
+              <w:rPr>
+                <w:rFonts w:ascii="Times New Roman" w:cs="Times New Roman" w:eastAsia="Times New Roman" w:hAnsi="Times New Roman"/>
+                <w:sz w:val="24"/>
+                <w:szCs w:val="24"/>
+                <w:rtl w:val="0"/>
+              </w:rPr>
               <w:t xml:space="preserve">{{itemUnit}}</w:t>
             </w:r>
           </w:p>
@@ -1111,8 +1150,8 @@
         <w:tc>
           <w:tcPr>
             <w:tcBorders>
-              <w:top w:color="cccccc" w:space="0" w:sz="6" w:val="single"/>
-              <w:left w:color="cccccc" w:space="0" w:sz="6" w:val="single"/>
+              <w:top w:color="000000" w:space="0" w:sz="6" w:val="single"/>
+              <w:left w:color="000000" w:space="0" w:sz="6" w:val="single"/>
               <w:bottom w:color="000000" w:space="0" w:sz="6" w:val="single"/>
               <w:right w:color="000000" w:space="0" w:sz="6" w:val="single"/>
             </w:tcBorders>
@@ -1143,45 +1182,6 @@
                 <w:szCs w:val="24"/>
                 <w:rtl w:val="0"/>
               </w:rPr>
-              <w:t xml:space="preserve">{{itemQuantity}}</w:t>
-            </w:r>
-          </w:p>
-        </w:tc>
-        <w:tc>
-          <w:tcPr>
-            <w:tcBorders>
-              <w:top w:color="cccccc" w:space="0" w:sz="6" w:val="single"/>
-              <w:left w:color="cccccc" w:space="0" w:sz="6" w:val="single"/>
-              <w:bottom w:color="000000" w:space="0" w:sz="6" w:val="single"/>
-              <w:right w:color="000000" w:space="0" w:sz="6" w:val="single"/>
-            </w:tcBorders>
-            <w:shd w:fill="auto" w:val="clear"/>
-            <w:tcMar>
-              <w:top w:w="99.77952755905513" w:type="dxa"/>
-              <w:left w:w="99.77952755905513" w:type="dxa"/>
-              <w:bottom w:w="99.77952755905513" w:type="dxa"/>
-              <w:right w:w="99.77952755905513" w:type="dxa"/>
-            </w:tcMar>
-            <w:vAlign w:val="center"/>
-          </w:tcPr>
-          <w:p>
-            <w:pPr>
-              <w:widowControl w:val="0"/>
-              <w:spacing w:line="240" w:lineRule="auto"/>
-              <w:jc w:val="center"/>
-              <w:rPr>
-                <w:rFonts w:ascii="Times New Roman" w:cs="Times New Roman" w:eastAsia="Times New Roman" w:hAnsi="Times New Roman"/>
-                <w:sz w:val="24"/>
-                <w:szCs w:val="24"/>
-              </w:rPr>
-            </w:pPr>
-            <w:r>
-              <w:rPr>
-                <w:rFonts w:ascii="Times New Roman" w:cs="Times New Roman" w:eastAsia="Times New Roman" w:hAnsi="Times New Roman"/>
-                <w:sz w:val="24"/>
-                <w:szCs w:val="24"/>
-                <w:rtl w:val="0"/>
-              </w:rPr>
               <w:t xml:space="preserve">{{itemPrice}}</w:t>
             </w:r>
           </w:p>
@@ -1189,8 +1189,8 @@
         <w:tc>
           <w:tcPr>
             <w:tcBorders>
-              <w:top w:color="cccccc" w:space="0" w:sz="6" w:val="single"/>
-              <w:left w:color="cccccc" w:space="0" w:sz="6" w:val="single"/>
+              <w:top w:color="000000" w:space="0" w:sz="6" w:val="single"/>
+              <w:left w:color="000000" w:space="0" w:sz="6" w:val="single"/>
               <w:bottom w:color="000000" w:space="0" w:sz="6" w:val="single"/>
               <w:right w:color="000000" w:space="0" w:sz="6" w:val="single"/>
             </w:tcBorders>
@@ -1236,7 +1236,7 @@
         <w:tc>
           <w:tcPr>
             <w:tcBorders>
-              <w:top w:color="cccccc" w:space="0" w:sz="6" w:val="single"/>
+              <w:top w:color="000000" w:space="0" w:sz="6" w:val="single"/>
               <w:left w:color="000000" w:space="0" w:sz="6" w:val="single"/>
               <w:bottom w:color="000000" w:space="0" w:sz="6" w:val="single"/>
               <w:right w:color="000000" w:space="0" w:sz="6" w:val="single"/>
@@ -1273,8 +1273,8 @@
         <w:tc>
           <w:tcPr>
             <w:tcBorders>
-              <w:top w:color="cccccc" w:space="0" w:sz="6" w:val="single"/>
-              <w:left w:color="cccccc" w:space="0" w:sz="6" w:val="single"/>
+              <w:top w:color="000000" w:space="0" w:sz="6" w:val="single"/>
+              <w:left w:color="000000" w:space="0" w:sz="6" w:val="single"/>
               <w:bottom w:color="000000" w:space="0" w:sz="6" w:val="single"/>
               <w:right w:color="000000" w:space="0" w:sz="6" w:val="single"/>
             </w:tcBorders>
@@ -1310,8 +1310,8 @@
         <w:tc>
           <w:tcPr>
             <w:tcBorders>
-              <w:top w:color="cccccc" w:space="0" w:sz="6" w:val="single"/>
-              <w:left w:color="cccccc" w:space="0" w:sz="6" w:val="single"/>
+              <w:top w:color="000000" w:space="0" w:sz="6" w:val="single"/>
+              <w:left w:color="000000" w:space="0" w:sz="6" w:val="single"/>
               <w:bottom w:color="000000" w:space="0" w:sz="6" w:val="single"/>
               <w:right w:color="000000" w:space="0" w:sz="6" w:val="single"/>
             </w:tcBorders>
@@ -1341,6 +1341,45 @@
                 <w:szCs w:val="24"/>
                 <w:rtl w:val="0"/>
               </w:rPr>
+              <w:t xml:space="preserve">{{itemQuantity}}</w:t>
+            </w:r>
+          </w:p>
+        </w:tc>
+        <w:tc>
+          <w:tcPr>
+            <w:tcBorders>
+              <w:top w:color="000000" w:space="0" w:sz="6" w:val="single"/>
+              <w:left w:color="000000" w:space="0" w:sz="6" w:val="single"/>
+              <w:bottom w:color="000000" w:space="0" w:sz="6" w:val="single"/>
+              <w:right w:color="000000" w:space="0" w:sz="6" w:val="single"/>
+            </w:tcBorders>
+            <w:shd w:fill="auto" w:val="clear"/>
+            <w:tcMar>
+              <w:top w:w="99.77952755905513" w:type="dxa"/>
+              <w:left w:w="99.77952755905513" w:type="dxa"/>
+              <w:bottom w:w="99.77952755905513" w:type="dxa"/>
+              <w:right w:w="99.77952755905513" w:type="dxa"/>
+            </w:tcMar>
+            <w:vAlign w:val="center"/>
+          </w:tcPr>
+          <w:p>
+            <w:pPr>
+              <w:widowControl w:val="0"/>
+              <w:spacing w:line="240" w:lineRule="auto"/>
+              <w:jc w:val="center"/>
+              <w:rPr>
+                <w:rFonts w:ascii="Times New Roman" w:cs="Times New Roman" w:eastAsia="Times New Roman" w:hAnsi="Times New Roman"/>
+                <w:sz w:val="24"/>
+                <w:szCs w:val="24"/>
+              </w:rPr>
+            </w:pPr>
+            <w:r>
+              <w:rPr>
+                <w:rFonts w:ascii="Times New Roman" w:cs="Times New Roman" w:eastAsia="Times New Roman" w:hAnsi="Times New Roman"/>
+                <w:sz w:val="24"/>
+                <w:szCs w:val="24"/>
+                <w:rtl w:val="0"/>
+              </w:rPr>
               <w:t xml:space="preserve">{{itemUnit}}</w:t>
             </w:r>
           </w:p>
@@ -1348,8 +1387,8 @@
         <w:tc>
           <w:tcPr>
             <w:tcBorders>
-              <w:top w:color="cccccc" w:space="0" w:sz="6" w:val="single"/>
-              <w:left w:color="cccccc" w:space="0" w:sz="6" w:val="single"/>
+              <w:top w:color="000000" w:space="0" w:sz="6" w:val="single"/>
+              <w:left w:color="000000" w:space="0" w:sz="6" w:val="single"/>
               <w:bottom w:color="000000" w:space="0" w:sz="6" w:val="single"/>
               <w:right w:color="000000" w:space="0" w:sz="6" w:val="single"/>
             </w:tcBorders>
@@ -1380,45 +1419,6 @@
                 <w:szCs w:val="24"/>
                 <w:rtl w:val="0"/>
               </w:rPr>
-              <w:t xml:space="preserve">{{itemQuantity}}</w:t>
-            </w:r>
-          </w:p>
-        </w:tc>
-        <w:tc>
-          <w:tcPr>
-            <w:tcBorders>
-              <w:top w:color="cccccc" w:space="0" w:sz="6" w:val="single"/>
-              <w:left w:color="cccccc" w:space="0" w:sz="6" w:val="single"/>
-              <w:bottom w:color="000000" w:space="0" w:sz="6" w:val="single"/>
-              <w:right w:color="000000" w:space="0" w:sz="6" w:val="single"/>
-            </w:tcBorders>
-            <w:shd w:fill="auto" w:val="clear"/>
-            <w:tcMar>
-              <w:top w:w="99.77952755905513" w:type="dxa"/>
-              <w:left w:w="99.77952755905513" w:type="dxa"/>
-              <w:bottom w:w="99.77952755905513" w:type="dxa"/>
-              <w:right w:w="99.77952755905513" w:type="dxa"/>
-            </w:tcMar>
-            <w:vAlign w:val="center"/>
-          </w:tcPr>
-          <w:p>
-            <w:pPr>
-              <w:widowControl w:val="0"/>
-              <w:spacing w:line="240" w:lineRule="auto"/>
-              <w:jc w:val="center"/>
-              <w:rPr>
-                <w:rFonts w:ascii="Times New Roman" w:cs="Times New Roman" w:eastAsia="Times New Roman" w:hAnsi="Times New Roman"/>
-                <w:sz w:val="24"/>
-                <w:szCs w:val="24"/>
-              </w:rPr>
-            </w:pPr>
-            <w:r>
-              <w:rPr>
-                <w:rFonts w:ascii="Times New Roman" w:cs="Times New Roman" w:eastAsia="Times New Roman" w:hAnsi="Times New Roman"/>
-                <w:sz w:val="24"/>
-                <w:szCs w:val="24"/>
-                <w:rtl w:val="0"/>
-              </w:rPr>
               <w:t xml:space="preserve">{{itemPrice}}</w:t>
             </w:r>
           </w:p>
@@ -1426,8 +1426,8 @@
         <w:tc>
           <w:tcPr>
             <w:tcBorders>
-              <w:top w:color="cccccc" w:space="0" w:sz="6" w:val="single"/>
-              <w:left w:color="cccccc" w:space="0" w:sz="6" w:val="single"/>
+              <w:top w:color="000000" w:space="0" w:sz="6" w:val="single"/>
+              <w:left w:color="000000" w:space="0" w:sz="6" w:val="single"/>
               <w:bottom w:color="000000" w:space="0" w:sz="6" w:val="single"/>
               <w:right w:color="000000" w:space="0" w:sz="6" w:val="single"/>
             </w:tcBorders>
@@ -1473,7 +1473,7 @@
         <w:tc>
           <w:tcPr>
             <w:tcBorders>
-              <w:top w:color="cccccc" w:space="0" w:sz="6" w:val="single"/>
+              <w:top w:color="000000" w:space="0" w:sz="6" w:val="single"/>
               <w:left w:color="000000" w:space="0" w:sz="6" w:val="single"/>
               <w:bottom w:color="000000" w:space="0" w:sz="6" w:val="single"/>
               <w:right w:color="000000" w:space="0" w:sz="6" w:val="single"/>
@@ -1510,8 +1510,8 @@
         <w:tc>
           <w:tcPr>
             <w:tcBorders>
-              <w:top w:color="cccccc" w:space="0" w:sz="6" w:val="single"/>
-              <w:left w:color="cccccc" w:space="0" w:sz="6" w:val="single"/>
+              <w:top w:color="000000" w:space="0" w:sz="6" w:val="single"/>
+              <w:left w:color="000000" w:space="0" w:sz="6" w:val="single"/>
               <w:bottom w:color="000000" w:space="0" w:sz="6" w:val="single"/>
               <w:right w:color="000000" w:space="0" w:sz="6" w:val="single"/>
             </w:tcBorders>
@@ -1547,8 +1547,8 @@
         <w:tc>
           <w:tcPr>
             <w:tcBorders>
-              <w:top w:color="cccccc" w:space="0" w:sz="6" w:val="single"/>
-              <w:left w:color="cccccc" w:space="0" w:sz="6" w:val="single"/>
+              <w:top w:color="000000" w:space="0" w:sz="6" w:val="single"/>
+              <w:left w:color="000000" w:space="0" w:sz="6" w:val="single"/>
               <w:bottom w:color="000000" w:space="0" w:sz="6" w:val="single"/>
               <w:right w:color="000000" w:space="0" w:sz="6" w:val="single"/>
             </w:tcBorders>
@@ -1578,6 +1578,45 @@
                 <w:szCs w:val="24"/>
                 <w:rtl w:val="0"/>
               </w:rPr>
+              <w:t xml:space="preserve">{{itemQuantity}}</w:t>
+            </w:r>
+          </w:p>
+        </w:tc>
+        <w:tc>
+          <w:tcPr>
+            <w:tcBorders>
+              <w:top w:color="000000" w:space="0" w:sz="6" w:val="single"/>
+              <w:left w:color="000000" w:space="0" w:sz="6" w:val="single"/>
+              <w:bottom w:color="000000" w:space="0" w:sz="6" w:val="single"/>
+              <w:right w:color="000000" w:space="0" w:sz="6" w:val="single"/>
+            </w:tcBorders>
+            <w:shd w:fill="auto" w:val="clear"/>
+            <w:tcMar>
+              <w:top w:w="99.77952755905513" w:type="dxa"/>
+              <w:left w:w="99.77952755905513" w:type="dxa"/>
+              <w:bottom w:w="99.77952755905513" w:type="dxa"/>
+              <w:right w:w="99.77952755905513" w:type="dxa"/>
+            </w:tcMar>
+            <w:vAlign w:val="center"/>
+          </w:tcPr>
+          <w:p>
+            <w:pPr>
+              <w:widowControl w:val="0"/>
+              <w:spacing w:line="240" w:lineRule="auto"/>
+              <w:jc w:val="center"/>
+              <w:rPr>
+                <w:rFonts w:ascii="Times New Roman" w:cs="Times New Roman" w:eastAsia="Times New Roman" w:hAnsi="Times New Roman"/>
+                <w:sz w:val="24"/>
+                <w:szCs w:val="24"/>
+              </w:rPr>
+            </w:pPr>
+            <w:r>
+              <w:rPr>
+                <w:rFonts w:ascii="Times New Roman" w:cs="Times New Roman" w:eastAsia="Times New Roman" w:hAnsi="Times New Roman"/>
+                <w:sz w:val="24"/>
+                <w:szCs w:val="24"/>
+                <w:rtl w:val="0"/>
+              </w:rPr>
               <w:t xml:space="preserve">{{itemUnit}}</w:t>
             </w:r>
           </w:p>
@@ -1585,8 +1624,8 @@
         <w:tc>
           <w:tcPr>
             <w:tcBorders>
-              <w:top w:color="cccccc" w:space="0" w:sz="6" w:val="single"/>
-              <w:left w:color="cccccc" w:space="0" w:sz="6" w:val="single"/>
+              <w:top w:color="000000" w:space="0" w:sz="6" w:val="single"/>
+              <w:left w:color="000000" w:space="0" w:sz="6" w:val="single"/>
               <w:bottom w:color="000000" w:space="0" w:sz="6" w:val="single"/>
               <w:right w:color="000000" w:space="0" w:sz="6" w:val="single"/>
             </w:tcBorders>
@@ -1617,45 +1656,6 @@
                 <w:szCs w:val="24"/>
                 <w:rtl w:val="0"/>
               </w:rPr>
-              <w:t xml:space="preserve">{{itemQuantity}}</w:t>
-            </w:r>
-          </w:p>
-        </w:tc>
-        <w:tc>
-          <w:tcPr>
-            <w:tcBorders>
-              <w:top w:color="cccccc" w:space="0" w:sz="6" w:val="single"/>
-              <w:left w:color="cccccc" w:space="0" w:sz="6" w:val="single"/>
-              <w:bottom w:color="000000" w:space="0" w:sz="6" w:val="single"/>
-              <w:right w:color="000000" w:space="0" w:sz="6" w:val="single"/>
-            </w:tcBorders>
-            <w:shd w:fill="auto" w:val="clear"/>
-            <w:tcMar>
-              <w:top w:w="99.77952755905513" w:type="dxa"/>
-              <w:left w:w="99.77952755905513" w:type="dxa"/>
-              <w:bottom w:w="99.77952755905513" w:type="dxa"/>
-              <w:right w:w="99.77952755905513" w:type="dxa"/>
-            </w:tcMar>
-            <w:vAlign w:val="center"/>
-          </w:tcPr>
-          <w:p>
-            <w:pPr>
-              <w:widowControl w:val="0"/>
-              <w:spacing w:line="240" w:lineRule="auto"/>
-              <w:jc w:val="center"/>
-              <w:rPr>
-                <w:rFonts w:ascii="Times New Roman" w:cs="Times New Roman" w:eastAsia="Times New Roman" w:hAnsi="Times New Roman"/>
-                <w:sz w:val="24"/>
-                <w:szCs w:val="24"/>
-              </w:rPr>
-            </w:pPr>
-            <w:r>
-              <w:rPr>
-                <w:rFonts w:ascii="Times New Roman" w:cs="Times New Roman" w:eastAsia="Times New Roman" w:hAnsi="Times New Roman"/>
-                <w:sz w:val="24"/>
-                <w:szCs w:val="24"/>
-                <w:rtl w:val="0"/>
-              </w:rPr>
               <w:t xml:space="preserve">{{itemPrice}}</w:t>
             </w:r>
           </w:p>
@@ -1663,8 +1663,8 @@
         <w:tc>
           <w:tcPr>
             <w:tcBorders>
-              <w:top w:color="cccccc" w:space="0" w:sz="6" w:val="single"/>
-              <w:left w:color="cccccc" w:space="0" w:sz="6" w:val="single"/>
+              <w:top w:color="000000" w:space="0" w:sz="6" w:val="single"/>
+              <w:left w:color="000000" w:space="0" w:sz="6" w:val="single"/>
               <w:bottom w:color="000000" w:space="0" w:sz="6" w:val="single"/>
               <w:right w:color="000000" w:space="0" w:sz="6" w:val="single"/>
             </w:tcBorders>
@@ -1710,7 +1710,7 @@
         <w:tc>
           <w:tcPr>
             <w:tcBorders>
-              <w:top w:color="cccccc" w:space="0" w:sz="6" w:val="single"/>
+              <w:top w:color="000000" w:space="0" w:sz="6" w:val="single"/>
               <w:left w:color="000000" w:space="0" w:sz="6" w:val="single"/>
               <w:bottom w:color="000000" w:space="0" w:sz="6" w:val="single"/>
               <w:right w:color="000000" w:space="0" w:sz="6" w:val="single"/>
@@ -1747,8 +1747,8 @@
         <w:tc>
           <w:tcPr>
             <w:tcBorders>
-              <w:top w:color="cccccc" w:space="0" w:sz="6" w:val="single"/>
-              <w:left w:color="cccccc" w:space="0" w:sz="6" w:val="single"/>
+              <w:top w:color="000000" w:space="0" w:sz="6" w:val="single"/>
+              <w:left w:color="000000" w:space="0" w:sz="6" w:val="single"/>
               <w:bottom w:color="000000" w:space="0" w:sz="6" w:val="single"/>
               <w:right w:color="000000" w:space="0" w:sz="6" w:val="single"/>
             </w:tcBorders>
@@ -1784,8 +1784,8 @@
         <w:tc>
           <w:tcPr>
             <w:tcBorders>
-              <w:top w:color="cccccc" w:space="0" w:sz="6" w:val="single"/>
-              <w:left w:color="cccccc" w:space="0" w:sz="6" w:val="single"/>
+              <w:top w:color="000000" w:space="0" w:sz="6" w:val="single"/>
+              <w:left w:color="000000" w:space="0" w:sz="6" w:val="single"/>
               <w:bottom w:color="000000" w:space="0" w:sz="6" w:val="single"/>
               <w:right w:color="000000" w:space="0" w:sz="6" w:val="single"/>
             </w:tcBorders>
@@ -1815,6 +1815,45 @@
                 <w:szCs w:val="24"/>
                 <w:rtl w:val="0"/>
               </w:rPr>
+              <w:t xml:space="preserve">{{itemQuantity}}</w:t>
+            </w:r>
+          </w:p>
+        </w:tc>
+        <w:tc>
+          <w:tcPr>
+            <w:tcBorders>
+              <w:top w:color="000000" w:space="0" w:sz="6" w:val="single"/>
+              <w:left w:color="000000" w:space="0" w:sz="6" w:val="single"/>
+              <w:bottom w:color="000000" w:space="0" w:sz="6" w:val="single"/>
+              <w:right w:color="000000" w:space="0" w:sz="6" w:val="single"/>
+            </w:tcBorders>
+            <w:shd w:fill="auto" w:val="clear"/>
+            <w:tcMar>
+              <w:top w:w="99.77952755905513" w:type="dxa"/>
+              <w:left w:w="99.77952755905513" w:type="dxa"/>
+              <w:bottom w:w="99.77952755905513" w:type="dxa"/>
+              <w:right w:w="99.77952755905513" w:type="dxa"/>
+            </w:tcMar>
+            <w:vAlign w:val="center"/>
+          </w:tcPr>
+          <w:p>
+            <w:pPr>
+              <w:widowControl w:val="0"/>
+              <w:spacing w:line="240" w:lineRule="auto"/>
+              <w:jc w:val="center"/>
+              <w:rPr>
+                <w:rFonts w:ascii="Times New Roman" w:cs="Times New Roman" w:eastAsia="Times New Roman" w:hAnsi="Times New Roman"/>
+                <w:sz w:val="24"/>
+                <w:szCs w:val="24"/>
+              </w:rPr>
+            </w:pPr>
+            <w:r>
+              <w:rPr>
+                <w:rFonts w:ascii="Times New Roman" w:cs="Times New Roman" w:eastAsia="Times New Roman" w:hAnsi="Times New Roman"/>
+                <w:sz w:val="24"/>
+                <w:szCs w:val="24"/>
+                <w:rtl w:val="0"/>
+              </w:rPr>
               <w:t xml:space="preserve">{{itemUnit}}</w:t>
             </w:r>
           </w:p>
@@ -1822,8 +1861,8 @@
         <w:tc>
           <w:tcPr>
             <w:tcBorders>
-              <w:top w:color="cccccc" w:space="0" w:sz="6" w:val="single"/>
-              <w:left w:color="cccccc" w:space="0" w:sz="6" w:val="single"/>
+              <w:top w:color="000000" w:space="0" w:sz="6" w:val="single"/>
+              <w:left w:color="000000" w:space="0" w:sz="6" w:val="single"/>
               <w:bottom w:color="000000" w:space="0" w:sz="6" w:val="single"/>
               <w:right w:color="000000" w:space="0" w:sz="6" w:val="single"/>
             </w:tcBorders>
@@ -1854,45 +1893,6 @@
                 <w:szCs w:val="24"/>
                 <w:rtl w:val="0"/>
               </w:rPr>
-              <w:t xml:space="preserve">{{itemQuantity}}</w:t>
-            </w:r>
-          </w:p>
-        </w:tc>
-        <w:tc>
-          <w:tcPr>
-            <w:tcBorders>
-              <w:top w:color="cccccc" w:space="0" w:sz="6" w:val="single"/>
-              <w:left w:color="cccccc" w:space="0" w:sz="6" w:val="single"/>
-              <w:bottom w:color="000000" w:space="0" w:sz="6" w:val="single"/>
-              <w:right w:color="000000" w:space="0" w:sz="6" w:val="single"/>
-            </w:tcBorders>
-            <w:shd w:fill="auto" w:val="clear"/>
-            <w:tcMar>
-              <w:top w:w="99.77952755905513" w:type="dxa"/>
-              <w:left w:w="99.77952755905513" w:type="dxa"/>
-              <w:bottom w:w="99.77952755905513" w:type="dxa"/>
-              <w:right w:w="99.77952755905513" w:type="dxa"/>
-            </w:tcMar>
-            <w:vAlign w:val="center"/>
-          </w:tcPr>
-          <w:p>
-            <w:pPr>
-              <w:widowControl w:val="0"/>
-              <w:spacing w:line="240" w:lineRule="auto"/>
-              <w:jc w:val="center"/>
-              <w:rPr>
-                <w:rFonts w:ascii="Times New Roman" w:cs="Times New Roman" w:eastAsia="Times New Roman" w:hAnsi="Times New Roman"/>
-                <w:sz w:val="24"/>
-                <w:szCs w:val="24"/>
-              </w:rPr>
-            </w:pPr>
-            <w:r>
-              <w:rPr>
-                <w:rFonts w:ascii="Times New Roman" w:cs="Times New Roman" w:eastAsia="Times New Roman" w:hAnsi="Times New Roman"/>
-                <w:sz w:val="24"/>
-                <w:szCs w:val="24"/>
-                <w:rtl w:val="0"/>
-              </w:rPr>
               <w:t xml:space="preserve">{{itemPrice}}</w:t>
             </w:r>
           </w:p>
@@ -1900,8 +1900,8 @@
         <w:tc>
           <w:tcPr>
             <w:tcBorders>
-              <w:top w:color="cccccc" w:space="0" w:sz="6" w:val="single"/>
-              <w:left w:color="cccccc" w:space="0" w:sz="6" w:val="single"/>
+              <w:top w:color="000000" w:space="0" w:sz="6" w:val="single"/>
+              <w:left w:color="000000" w:space="0" w:sz="6" w:val="single"/>
               <w:bottom w:color="000000" w:space="0" w:sz="6" w:val="single"/>
               <w:right w:color="000000" w:space="0" w:sz="6" w:val="single"/>
             </w:tcBorders>
@@ -1947,7 +1947,7 @@
         <w:tc>
           <w:tcPr>
             <w:tcBorders>
-              <w:top w:color="cccccc" w:space="0" w:sz="6" w:val="single"/>
+              <w:top w:color="000000" w:space="0" w:sz="6" w:val="single"/>
               <w:left w:color="000000" w:space="0" w:sz="6" w:val="single"/>
               <w:bottom w:color="000000" w:space="0" w:sz="6" w:val="single"/>
               <w:right w:color="000000" w:space="0" w:sz="6" w:val="single"/>
@@ -1984,8 +1984,8 @@
         <w:tc>
           <w:tcPr>
             <w:tcBorders>
-              <w:top w:color="cccccc" w:space="0" w:sz="6" w:val="single"/>
-              <w:left w:color="cccccc" w:space="0" w:sz="6" w:val="single"/>
+              <w:top w:color="000000" w:space="0" w:sz="6" w:val="single"/>
+              <w:left w:color="000000" w:space="0" w:sz="6" w:val="single"/>
               <w:bottom w:color="000000" w:space="0" w:sz="6" w:val="single"/>
               <w:right w:color="000000" w:space="0" w:sz="6" w:val="single"/>
             </w:tcBorders>
@@ -2021,8 +2021,8 @@
         <w:tc>
           <w:tcPr>
             <w:tcBorders>
-              <w:top w:color="cccccc" w:space="0" w:sz="6" w:val="single"/>
-              <w:left w:color="cccccc" w:space="0" w:sz="6" w:val="single"/>
+              <w:top w:color="000000" w:space="0" w:sz="6" w:val="single"/>
+              <w:left w:color="000000" w:space="0" w:sz="6" w:val="single"/>
               <w:bottom w:color="000000" w:space="0" w:sz="6" w:val="single"/>
               <w:right w:color="000000" w:space="0" w:sz="6" w:val="single"/>
             </w:tcBorders>
@@ -2052,6 +2052,45 @@
                 <w:szCs w:val="24"/>
                 <w:rtl w:val="0"/>
               </w:rPr>
+              <w:t xml:space="preserve">{{itemQuantity}}</w:t>
+            </w:r>
+          </w:p>
+        </w:tc>
+        <w:tc>
+          <w:tcPr>
+            <w:tcBorders>
+              <w:top w:color="000000" w:space="0" w:sz="6" w:val="single"/>
+              <w:left w:color="000000" w:space="0" w:sz="6" w:val="single"/>
+              <w:bottom w:color="000000" w:space="0" w:sz="6" w:val="single"/>
+              <w:right w:color="000000" w:space="0" w:sz="6" w:val="single"/>
+            </w:tcBorders>
+            <w:shd w:fill="auto" w:val="clear"/>
+            <w:tcMar>
+              <w:top w:w="99.77952755905513" w:type="dxa"/>
+              <w:left w:w="99.77952755905513" w:type="dxa"/>
+              <w:bottom w:w="99.77952755905513" w:type="dxa"/>
+              <w:right w:w="99.77952755905513" w:type="dxa"/>
+            </w:tcMar>
+            <w:vAlign w:val="center"/>
+          </w:tcPr>
+          <w:p>
+            <w:pPr>
+              <w:widowControl w:val="0"/>
+              <w:spacing w:line="240" w:lineRule="auto"/>
+              <w:jc w:val="center"/>
+              <w:rPr>
+                <w:rFonts w:ascii="Times New Roman" w:cs="Times New Roman" w:eastAsia="Times New Roman" w:hAnsi="Times New Roman"/>
+                <w:sz w:val="24"/>
+                <w:szCs w:val="24"/>
+              </w:rPr>
+            </w:pPr>
+            <w:r>
+              <w:rPr>
+                <w:rFonts w:ascii="Times New Roman" w:cs="Times New Roman" w:eastAsia="Times New Roman" w:hAnsi="Times New Roman"/>
+                <w:sz w:val="24"/>
+                <w:szCs w:val="24"/>
+                <w:rtl w:val="0"/>
+              </w:rPr>
               <w:t xml:space="preserve">{{itemUnit}}</w:t>
             </w:r>
           </w:p>
@@ -2059,8 +2098,8 @@
         <w:tc>
           <w:tcPr>
             <w:tcBorders>
-              <w:top w:color="cccccc" w:space="0" w:sz="6" w:val="single"/>
-              <w:left w:color="cccccc" w:space="0" w:sz="6" w:val="single"/>
+              <w:top w:color="000000" w:space="0" w:sz="6" w:val="single"/>
+              <w:left w:color="000000" w:space="0" w:sz="6" w:val="single"/>
               <w:bottom w:color="000000" w:space="0" w:sz="6" w:val="single"/>
               <w:right w:color="000000" w:space="0" w:sz="6" w:val="single"/>
             </w:tcBorders>
@@ -2091,45 +2130,6 @@
                 <w:szCs w:val="24"/>
                 <w:rtl w:val="0"/>
               </w:rPr>
-              <w:t xml:space="preserve">{{itemQuantity}}</w:t>
-            </w:r>
-          </w:p>
-        </w:tc>
-        <w:tc>
-          <w:tcPr>
-            <w:tcBorders>
-              <w:top w:color="cccccc" w:space="0" w:sz="6" w:val="single"/>
-              <w:left w:color="cccccc" w:space="0" w:sz="6" w:val="single"/>
-              <w:bottom w:color="000000" w:space="0" w:sz="6" w:val="single"/>
-              <w:right w:color="000000" w:space="0" w:sz="6" w:val="single"/>
-            </w:tcBorders>
-            <w:shd w:fill="auto" w:val="clear"/>
-            <w:tcMar>
-              <w:top w:w="99.77952755905513" w:type="dxa"/>
-              <w:left w:w="99.77952755905513" w:type="dxa"/>
-              <w:bottom w:w="99.77952755905513" w:type="dxa"/>
-              <w:right w:w="99.77952755905513" w:type="dxa"/>
-            </w:tcMar>
-            <w:vAlign w:val="center"/>
-          </w:tcPr>
-          <w:p>
-            <w:pPr>
-              <w:widowControl w:val="0"/>
-              <w:spacing w:line="240" w:lineRule="auto"/>
-              <w:jc w:val="center"/>
-              <w:rPr>
-                <w:rFonts w:ascii="Times New Roman" w:cs="Times New Roman" w:eastAsia="Times New Roman" w:hAnsi="Times New Roman"/>
-                <w:sz w:val="24"/>
-                <w:szCs w:val="24"/>
-              </w:rPr>
-            </w:pPr>
-            <w:r>
-              <w:rPr>
-                <w:rFonts w:ascii="Times New Roman" w:cs="Times New Roman" w:eastAsia="Times New Roman" w:hAnsi="Times New Roman"/>
-                <w:sz w:val="24"/>
-                <w:szCs w:val="24"/>
-                <w:rtl w:val="0"/>
-              </w:rPr>
               <w:t xml:space="preserve">{{itemPrice}}</w:t>
             </w:r>
           </w:p>
@@ -2137,8 +2137,8 @@
         <w:tc>
           <w:tcPr>
             <w:tcBorders>
-              <w:top w:color="cccccc" w:space="0" w:sz="6" w:val="single"/>
-              <w:left w:color="cccccc" w:space="0" w:sz="6" w:val="single"/>
+              <w:top w:color="000000" w:space="0" w:sz="6" w:val="single"/>
+              <w:left w:color="000000" w:space="0" w:sz="6" w:val="single"/>
               <w:bottom w:color="000000" w:space="0" w:sz="6" w:val="single"/>
               <w:right w:color="000000" w:space="0" w:sz="6" w:val="single"/>
             </w:tcBorders>
@@ -2184,7 +2184,7 @@
         <w:tc>
           <w:tcPr>
             <w:tcBorders>
-              <w:top w:color="cccccc" w:space="0" w:sz="6" w:val="single"/>
+              <w:top w:color="000000" w:space="0" w:sz="6" w:val="single"/>
               <w:left w:color="000000" w:space="0" w:sz="6" w:val="single"/>
               <w:bottom w:color="000000" w:space="0" w:sz="6" w:val="single"/>
               <w:right w:color="000000" w:space="0" w:sz="6" w:val="single"/>
@@ -2221,8 +2221,8 @@
         <w:tc>
           <w:tcPr>
             <w:tcBorders>
-              <w:top w:color="cccccc" w:space="0" w:sz="6" w:val="single"/>
-              <w:left w:color="cccccc" w:space="0" w:sz="6" w:val="single"/>
+              <w:top w:color="000000" w:space="0" w:sz="6" w:val="single"/>
+              <w:left w:color="000000" w:space="0" w:sz="6" w:val="single"/>
               <w:bottom w:color="000000" w:space="0" w:sz="6" w:val="single"/>
               <w:right w:color="000000" w:space="0" w:sz="6" w:val="single"/>
             </w:tcBorders>
@@ -2258,8 +2258,8 @@
         <w:tc>
           <w:tcPr>
             <w:tcBorders>
-              <w:top w:color="cccccc" w:space="0" w:sz="6" w:val="single"/>
-              <w:left w:color="cccccc" w:space="0" w:sz="6" w:val="single"/>
+              <w:top w:color="000000" w:space="0" w:sz="6" w:val="single"/>
+              <w:left w:color="000000" w:space="0" w:sz="6" w:val="single"/>
               <w:bottom w:color="000000" w:space="0" w:sz="6" w:val="single"/>
               <w:right w:color="000000" w:space="0" w:sz="6" w:val="single"/>
             </w:tcBorders>
@@ -2289,6 +2289,45 @@
                 <w:szCs w:val="24"/>
                 <w:rtl w:val="0"/>
               </w:rPr>
+              <w:t xml:space="preserve">{{itemQuantity}}</w:t>
+            </w:r>
+          </w:p>
+        </w:tc>
+        <w:tc>
+          <w:tcPr>
+            <w:tcBorders>
+              <w:top w:color="000000" w:space="0" w:sz="6" w:val="single"/>
+              <w:left w:color="000000" w:space="0" w:sz="6" w:val="single"/>
+              <w:bottom w:color="000000" w:space="0" w:sz="6" w:val="single"/>
+              <w:right w:color="000000" w:space="0" w:sz="6" w:val="single"/>
+            </w:tcBorders>
+            <w:shd w:fill="auto" w:val="clear"/>
+            <w:tcMar>
+              <w:top w:w="99.77952755905513" w:type="dxa"/>
+              <w:left w:w="99.77952755905513" w:type="dxa"/>
+              <w:bottom w:w="99.77952755905513" w:type="dxa"/>
+              <w:right w:w="99.77952755905513" w:type="dxa"/>
+            </w:tcMar>
+            <w:vAlign w:val="center"/>
+          </w:tcPr>
+          <w:p>
+            <w:pPr>
+              <w:widowControl w:val="0"/>
+              <w:spacing w:line="240" w:lineRule="auto"/>
+              <w:jc w:val="center"/>
+              <w:rPr>
+                <w:rFonts w:ascii="Times New Roman" w:cs="Times New Roman" w:eastAsia="Times New Roman" w:hAnsi="Times New Roman"/>
+                <w:sz w:val="24"/>
+                <w:szCs w:val="24"/>
+              </w:rPr>
+            </w:pPr>
+            <w:r>
+              <w:rPr>
+                <w:rFonts w:ascii="Times New Roman" w:cs="Times New Roman" w:eastAsia="Times New Roman" w:hAnsi="Times New Roman"/>
+                <w:sz w:val="24"/>
+                <w:szCs w:val="24"/>
+                <w:rtl w:val="0"/>
+              </w:rPr>
               <w:t xml:space="preserve">{{itemUnit}}</w:t>
             </w:r>
           </w:p>
@@ -2296,8 +2335,8 @@
         <w:tc>
           <w:tcPr>
             <w:tcBorders>
-              <w:top w:color="cccccc" w:space="0" w:sz="6" w:val="single"/>
-              <w:left w:color="cccccc" w:space="0" w:sz="6" w:val="single"/>
+              <w:top w:color="000000" w:space="0" w:sz="6" w:val="single"/>
+              <w:left w:color="000000" w:space="0" w:sz="6" w:val="single"/>
               <w:bottom w:color="000000" w:space="0" w:sz="6" w:val="single"/>
               <w:right w:color="000000" w:space="0" w:sz="6" w:val="single"/>
             </w:tcBorders>
@@ -2328,45 +2367,6 @@
                 <w:szCs w:val="24"/>
                 <w:rtl w:val="0"/>
               </w:rPr>
-              <w:t xml:space="preserve">{{itemQuantity}}</w:t>
-            </w:r>
-          </w:p>
-        </w:tc>
-        <w:tc>
-          <w:tcPr>
-            <w:tcBorders>
-              <w:top w:color="cccccc" w:space="0" w:sz="6" w:val="single"/>
-              <w:left w:color="cccccc" w:space="0" w:sz="6" w:val="single"/>
-              <w:bottom w:color="000000" w:space="0" w:sz="6" w:val="single"/>
-              <w:right w:color="000000" w:space="0" w:sz="6" w:val="single"/>
-            </w:tcBorders>
-            <w:shd w:fill="auto" w:val="clear"/>
-            <w:tcMar>
-              <w:top w:w="99.77952755905513" w:type="dxa"/>
-              <w:left w:w="99.77952755905513" w:type="dxa"/>
-              <w:bottom w:w="99.77952755905513" w:type="dxa"/>
-              <w:right w:w="99.77952755905513" w:type="dxa"/>
-            </w:tcMar>
-            <w:vAlign w:val="center"/>
-          </w:tcPr>
-          <w:p>
-            <w:pPr>
-              <w:widowControl w:val="0"/>
-              <w:spacing w:line="240" w:lineRule="auto"/>
-              <w:jc w:val="center"/>
-              <w:rPr>
-                <w:rFonts w:ascii="Times New Roman" w:cs="Times New Roman" w:eastAsia="Times New Roman" w:hAnsi="Times New Roman"/>
-                <w:sz w:val="24"/>
-                <w:szCs w:val="24"/>
-              </w:rPr>
-            </w:pPr>
-            <w:r>
-              <w:rPr>
-                <w:rFonts w:ascii="Times New Roman" w:cs="Times New Roman" w:eastAsia="Times New Roman" w:hAnsi="Times New Roman"/>
-                <w:sz w:val="24"/>
-                <w:szCs w:val="24"/>
-                <w:rtl w:val="0"/>
-              </w:rPr>
               <w:t xml:space="preserve">{{itemPrice}}</w:t>
             </w:r>
           </w:p>
@@ -2374,8 +2374,8 @@
         <w:tc>
           <w:tcPr>
             <w:tcBorders>
-              <w:top w:color="cccccc" w:space="0" w:sz="6" w:val="single"/>
-              <w:left w:color="cccccc" w:space="0" w:sz="6" w:val="single"/>
+              <w:top w:color="000000" w:space="0" w:sz="6" w:val="single"/>
+              <w:left w:color="000000" w:space="0" w:sz="6" w:val="single"/>
               <w:bottom w:color="000000" w:space="0" w:sz="6" w:val="single"/>
               <w:right w:color="000000" w:space="0" w:sz="6" w:val="single"/>
             </w:tcBorders>
@@ -2421,7 +2421,7 @@
         <w:tc>
           <w:tcPr>
             <w:tcBorders>
-              <w:top w:color="cccccc" w:space="0" w:sz="6" w:val="single"/>
+              <w:top w:color="000000" w:space="0" w:sz="6" w:val="single"/>
               <w:left w:color="000000" w:space="0" w:sz="6" w:val="single"/>
               <w:bottom w:color="000000" w:space="0" w:sz="6" w:val="single"/>
               <w:right w:color="000000" w:space="0" w:sz="6" w:val="single"/>
@@ -2458,8 +2458,8 @@
         <w:tc>
           <w:tcPr>
             <w:tcBorders>
-              <w:top w:color="cccccc" w:space="0" w:sz="6" w:val="single"/>
-              <w:left w:color="cccccc" w:space="0" w:sz="6" w:val="single"/>
+              <w:top w:color="000000" w:space="0" w:sz="6" w:val="single"/>
+              <w:left w:color="000000" w:space="0" w:sz="6" w:val="single"/>
               <w:bottom w:color="000000" w:space="0" w:sz="6" w:val="single"/>
               <w:right w:color="000000" w:space="0" w:sz="6" w:val="single"/>
             </w:tcBorders>
@@ -2495,8 +2495,8 @@
         <w:tc>
           <w:tcPr>
             <w:tcBorders>
-              <w:top w:color="cccccc" w:space="0" w:sz="6" w:val="single"/>
-              <w:left w:color="cccccc" w:space="0" w:sz="6" w:val="single"/>
+              <w:top w:color="000000" w:space="0" w:sz="6" w:val="single"/>
+              <w:left w:color="000000" w:space="0" w:sz="6" w:val="single"/>
               <w:bottom w:color="000000" w:space="0" w:sz="6" w:val="single"/>
               <w:right w:color="000000" w:space="0" w:sz="6" w:val="single"/>
             </w:tcBorders>
@@ -2526,6 +2526,45 @@
                 <w:szCs w:val="24"/>
                 <w:rtl w:val="0"/>
               </w:rPr>
+              <w:t xml:space="preserve">{{itemQuantity}}</w:t>
+            </w:r>
+          </w:p>
+        </w:tc>
+        <w:tc>
+          <w:tcPr>
+            <w:tcBorders>
+              <w:top w:color="000000" w:space="0" w:sz="6" w:val="single"/>
+              <w:left w:color="000000" w:space="0" w:sz="6" w:val="single"/>
+              <w:bottom w:color="000000" w:space="0" w:sz="6" w:val="single"/>
+              <w:right w:color="000000" w:space="0" w:sz="6" w:val="single"/>
+            </w:tcBorders>
+            <w:shd w:fill="auto" w:val="clear"/>
+            <w:tcMar>
+              <w:top w:w="99.77952755905513" w:type="dxa"/>
+              <w:left w:w="99.77952755905513" w:type="dxa"/>
+              <w:bottom w:w="99.77952755905513" w:type="dxa"/>
+              <w:right w:w="99.77952755905513" w:type="dxa"/>
+            </w:tcMar>
+            <w:vAlign w:val="center"/>
+          </w:tcPr>
+          <w:p>
+            <w:pPr>
+              <w:widowControl w:val="0"/>
+              <w:spacing w:line="240" w:lineRule="auto"/>
+              <w:jc w:val="center"/>
+              <w:rPr>
+                <w:rFonts w:ascii="Times New Roman" w:cs="Times New Roman" w:eastAsia="Times New Roman" w:hAnsi="Times New Roman"/>
+                <w:sz w:val="24"/>
+                <w:szCs w:val="24"/>
+              </w:rPr>
+            </w:pPr>
+            <w:r>
+              <w:rPr>
+                <w:rFonts w:ascii="Times New Roman" w:cs="Times New Roman" w:eastAsia="Times New Roman" w:hAnsi="Times New Roman"/>
+                <w:sz w:val="24"/>
+                <w:szCs w:val="24"/>
+                <w:rtl w:val="0"/>
+              </w:rPr>
               <w:t xml:space="preserve">{{itemUnit}}</w:t>
             </w:r>
           </w:p>
@@ -2533,8 +2572,8 @@
         <w:tc>
           <w:tcPr>
             <w:tcBorders>
-              <w:top w:color="cccccc" w:space="0" w:sz="6" w:val="single"/>
-              <w:left w:color="cccccc" w:space="0" w:sz="6" w:val="single"/>
+              <w:top w:color="000000" w:space="0" w:sz="6" w:val="single"/>
+              <w:left w:color="000000" w:space="0" w:sz="6" w:val="single"/>
               <w:bottom w:color="000000" w:space="0" w:sz="6" w:val="single"/>
               <w:right w:color="000000" w:space="0" w:sz="6" w:val="single"/>
             </w:tcBorders>
@@ -2565,45 +2604,6 @@
                 <w:szCs w:val="24"/>
                 <w:rtl w:val="0"/>
               </w:rPr>
-              <w:t xml:space="preserve">{{itemQuantity}}</w:t>
-            </w:r>
-          </w:p>
-        </w:tc>
-        <w:tc>
-          <w:tcPr>
-            <w:tcBorders>
-              <w:top w:color="cccccc" w:space="0" w:sz="6" w:val="single"/>
-              <w:left w:color="cccccc" w:space="0" w:sz="6" w:val="single"/>
-              <w:bottom w:color="000000" w:space="0" w:sz="6" w:val="single"/>
-              <w:right w:color="000000" w:space="0" w:sz="6" w:val="single"/>
-            </w:tcBorders>
-            <w:shd w:fill="auto" w:val="clear"/>
-            <w:tcMar>
-              <w:top w:w="99.77952755905513" w:type="dxa"/>
-              <w:left w:w="99.77952755905513" w:type="dxa"/>
-              <w:bottom w:w="99.77952755905513" w:type="dxa"/>
-              <w:right w:w="99.77952755905513" w:type="dxa"/>
-            </w:tcMar>
-            <w:vAlign w:val="center"/>
-          </w:tcPr>
-          <w:p>
-            <w:pPr>
-              <w:widowControl w:val="0"/>
-              <w:spacing w:line="240" w:lineRule="auto"/>
-              <w:jc w:val="center"/>
-              <w:rPr>
-                <w:rFonts w:ascii="Times New Roman" w:cs="Times New Roman" w:eastAsia="Times New Roman" w:hAnsi="Times New Roman"/>
-                <w:sz w:val="24"/>
-                <w:szCs w:val="24"/>
-              </w:rPr>
-            </w:pPr>
-            <w:r>
-              <w:rPr>
-                <w:rFonts w:ascii="Times New Roman" w:cs="Times New Roman" w:eastAsia="Times New Roman" w:hAnsi="Times New Roman"/>
-                <w:sz w:val="24"/>
-                <w:szCs w:val="24"/>
-                <w:rtl w:val="0"/>
-              </w:rPr>
               <w:t xml:space="preserve">{{itemPrice}}</w:t>
             </w:r>
           </w:p>
@@ -2611,8 +2611,8 @@
         <w:tc>
           <w:tcPr>
             <w:tcBorders>
-              <w:top w:color="cccccc" w:space="0" w:sz="6" w:val="single"/>
-              <w:left w:color="cccccc" w:space="0" w:sz="6" w:val="single"/>
+              <w:top w:color="000000" w:space="0" w:sz="6" w:val="single"/>
+              <w:left w:color="000000" w:space="0" w:sz="6" w:val="single"/>
               <w:bottom w:color="000000" w:space="0" w:sz="6" w:val="single"/>
               <w:right w:color="000000" w:space="0" w:sz="6" w:val="single"/>
             </w:tcBorders>
@@ -2658,7 +2658,7 @@
         <w:tc>
           <w:tcPr>
             <w:tcBorders>
-              <w:top w:color="cccccc" w:space="0" w:sz="6" w:val="single"/>
+              <w:top w:color="000000" w:space="0" w:sz="6" w:val="single"/>
               <w:left w:color="000000" w:space="0" w:sz="6" w:val="single"/>
               <w:bottom w:color="000000" w:space="0" w:sz="6" w:val="single"/>
               <w:right w:color="000000" w:space="0" w:sz="6" w:val="single"/>
@@ -2695,8 +2695,8 @@
         <w:tc>
           <w:tcPr>
             <w:tcBorders>
-              <w:top w:color="cccccc" w:space="0" w:sz="6" w:val="single"/>
-              <w:left w:color="cccccc" w:space="0" w:sz="6" w:val="single"/>
+              <w:top w:color="000000" w:space="0" w:sz="6" w:val="single"/>
+              <w:left w:color="000000" w:space="0" w:sz="6" w:val="single"/>
               <w:bottom w:color="000000" w:space="0" w:sz="6" w:val="single"/>
               <w:right w:color="000000" w:space="0" w:sz="6" w:val="single"/>
             </w:tcBorders>
@@ -2732,8 +2732,8 @@
         <w:tc>
           <w:tcPr>
             <w:tcBorders>
-              <w:top w:color="cccccc" w:space="0" w:sz="6" w:val="single"/>
-              <w:left w:color="cccccc" w:space="0" w:sz="6" w:val="single"/>
+              <w:top w:color="000000" w:space="0" w:sz="6" w:val="single"/>
+              <w:left w:color="000000" w:space="0" w:sz="6" w:val="single"/>
               <w:bottom w:color="000000" w:space="0" w:sz="6" w:val="single"/>
               <w:right w:color="000000" w:space="0" w:sz="6" w:val="single"/>
             </w:tcBorders>
@@ -2763,6 +2763,45 @@
                 <w:szCs w:val="24"/>
                 <w:rtl w:val="0"/>
               </w:rPr>
+              <w:t xml:space="preserve">{{itemQuantity}}</w:t>
+            </w:r>
+          </w:p>
+        </w:tc>
+        <w:tc>
+          <w:tcPr>
+            <w:tcBorders>
+              <w:top w:color="000000" w:space="0" w:sz="6" w:val="single"/>
+              <w:left w:color="000000" w:space="0" w:sz="6" w:val="single"/>
+              <w:bottom w:color="000000" w:space="0" w:sz="6" w:val="single"/>
+              <w:right w:color="000000" w:space="0" w:sz="6" w:val="single"/>
+            </w:tcBorders>
+            <w:shd w:fill="auto" w:val="clear"/>
+            <w:tcMar>
+              <w:top w:w="99.77952755905513" w:type="dxa"/>
+              <w:left w:w="99.77952755905513" w:type="dxa"/>
+              <w:bottom w:w="99.77952755905513" w:type="dxa"/>
+              <w:right w:w="99.77952755905513" w:type="dxa"/>
+            </w:tcMar>
+            <w:vAlign w:val="center"/>
+          </w:tcPr>
+          <w:p>
+            <w:pPr>
+              <w:widowControl w:val="0"/>
+              <w:spacing w:line="240" w:lineRule="auto"/>
+              <w:jc w:val="center"/>
+              <w:rPr>
+                <w:rFonts w:ascii="Times New Roman" w:cs="Times New Roman" w:eastAsia="Times New Roman" w:hAnsi="Times New Roman"/>
+                <w:sz w:val="24"/>
+                <w:szCs w:val="24"/>
+              </w:rPr>
+            </w:pPr>
+            <w:r>
+              <w:rPr>
+                <w:rFonts w:ascii="Times New Roman" w:cs="Times New Roman" w:eastAsia="Times New Roman" w:hAnsi="Times New Roman"/>
+                <w:sz w:val="24"/>
+                <w:szCs w:val="24"/>
+                <w:rtl w:val="0"/>
+              </w:rPr>
               <w:t xml:space="preserve">{{itemUnit}}</w:t>
             </w:r>
           </w:p>
@@ -2770,8 +2809,8 @@
         <w:tc>
           <w:tcPr>
             <w:tcBorders>
-              <w:top w:color="cccccc" w:space="0" w:sz="6" w:val="single"/>
-              <w:left w:color="cccccc" w:space="0" w:sz="6" w:val="single"/>
+              <w:top w:color="000000" w:space="0" w:sz="6" w:val="single"/>
+              <w:left w:color="000000" w:space="0" w:sz="6" w:val="single"/>
               <w:bottom w:color="000000" w:space="0" w:sz="6" w:val="single"/>
               <w:right w:color="000000" w:space="0" w:sz="6" w:val="single"/>
             </w:tcBorders>
@@ -2802,45 +2841,6 @@
                 <w:szCs w:val="24"/>
                 <w:rtl w:val="0"/>
               </w:rPr>
-              <w:t xml:space="preserve">{{itemQuantity}}</w:t>
-            </w:r>
-          </w:p>
-        </w:tc>
-        <w:tc>
-          <w:tcPr>
-            <w:tcBorders>
-              <w:top w:color="cccccc" w:space="0" w:sz="6" w:val="single"/>
-              <w:left w:color="cccccc" w:space="0" w:sz="6" w:val="single"/>
-              <w:bottom w:color="000000" w:space="0" w:sz="6" w:val="single"/>
-              <w:right w:color="000000" w:space="0" w:sz="6" w:val="single"/>
-            </w:tcBorders>
-            <w:shd w:fill="auto" w:val="clear"/>
-            <w:tcMar>
-              <w:top w:w="99.77952755905513" w:type="dxa"/>
-              <w:left w:w="99.77952755905513" w:type="dxa"/>
-              <w:bottom w:w="99.77952755905513" w:type="dxa"/>
-              <w:right w:w="99.77952755905513" w:type="dxa"/>
-            </w:tcMar>
-            <w:vAlign w:val="center"/>
-          </w:tcPr>
-          <w:p>
-            <w:pPr>
-              <w:widowControl w:val="0"/>
-              <w:spacing w:line="240" w:lineRule="auto"/>
-              <w:jc w:val="center"/>
-              <w:rPr>
-                <w:rFonts w:ascii="Times New Roman" w:cs="Times New Roman" w:eastAsia="Times New Roman" w:hAnsi="Times New Roman"/>
-                <w:sz w:val="24"/>
-                <w:szCs w:val="24"/>
-              </w:rPr>
-            </w:pPr>
-            <w:r>
-              <w:rPr>
-                <w:rFonts w:ascii="Times New Roman" w:cs="Times New Roman" w:eastAsia="Times New Roman" w:hAnsi="Times New Roman"/>
-                <w:sz w:val="24"/>
-                <w:szCs w:val="24"/>
-                <w:rtl w:val="0"/>
-              </w:rPr>
               <w:t xml:space="preserve">{{itemPrice}}</w:t>
             </w:r>
           </w:p>
@@ -2848,8 +2848,8 @@
         <w:tc>
           <w:tcPr>
             <w:tcBorders>
-              <w:top w:color="cccccc" w:space="0" w:sz="6" w:val="single"/>
-              <w:left w:color="cccccc" w:space="0" w:sz="6" w:val="single"/>
+              <w:top w:color="000000" w:space="0" w:sz="6" w:val="single"/>
+              <w:left w:color="000000" w:space="0" w:sz="6" w:val="single"/>
               <w:bottom w:color="000000" w:space="0" w:sz="6" w:val="single"/>
               <w:right w:color="000000" w:space="0" w:sz="6" w:val="single"/>
             </w:tcBorders>
@@ -2894,7 +2894,7 @@
         <w:tc>
           <w:tcPr>
             <w:tcBorders>
-              <w:bottom w:color="000000" w:space="0" w:sz="4" w:val="single"/>
+              <w:bottom w:color="000000" w:space="0" w:sz="6" w:val="single"/>
             </w:tcBorders>
             <w:shd w:fill="auto" w:val="clear"/>
             <w:tcMar>
@@ -2938,7 +2938,7 @@
           <w:tcPr>
             <w:gridSpan w:val="4"/>
             <w:tcBorders>
-              <w:bottom w:color="000000" w:space="0" w:sz="4" w:val="single"/>
+              <w:bottom w:color="000000" w:space="0" w:sz="6" w:val="single"/>
             </w:tcBorders>
             <w:shd w:fill="auto" w:val="clear"/>
             <w:tcMar>
@@ -2978,7 +2978,7 @@
         <w:tc>
           <w:tcPr>
             <w:tcBorders>
-              <w:bottom w:color="000000" w:space="0" w:sz="4" w:val="single"/>
+              <w:bottom w:color="000000" w:space="0" w:sz="6" w:val="single"/>
             </w:tcBorders>
             <w:shd w:fill="auto" w:val="clear"/>
             <w:tcMar>

</xml_diff>